<commit_message>
Added the lat and long in getShops
</commit_message>
<xml_diff>
--- a/IMPORTANT DOCS/WORD/Locinder Updates.docx
+++ b/IMPORTANT DOCS/WORD/Locinder Updates.docx
@@ -208,6 +208,147 @@
     </w:p>
     <w:p>
       <w:pPr>
+        <w:rPr>
+          <w:rFonts w:ascii="Arial" w:hAnsi="Arial" w:cs="Arial"/>
+          <w:sz w:val="20"/>
+        </w:rPr>
+      </w:pPr>
+      <w:r>
+        <w:rPr>
+          <w:rFonts w:ascii="Arial" w:hAnsi="Arial" w:cs="Arial"/>
+          <w:sz w:val="20"/>
+        </w:rPr>
+        <w:t>- Update the route ability guards for cashier = DONE, barista, kitchen, and dev scopes.</w:t>
+      </w:r>
+    </w:p>
+    <w:p>
+      <w:pPr>
+        <w:pBdr>
+          <w:top w:val="single" w:sz="6" w:space="1" w:color="auto"/>
+          <w:bottom w:val="single" w:sz="6" w:space="1" w:color="auto"/>
+        </w:pBdr>
+        <w:rPr>
+          <w:rFonts w:ascii="Arial" w:hAnsi="Arial" w:cs="Arial"/>
+          <w:sz w:val="20"/>
+        </w:rPr>
+      </w:pPr>
+      <w:r>
+        <w:rPr>
+          <w:rFonts w:ascii="Arial" w:hAnsi="Arial" w:cs="Arial"/>
+          <w:sz w:val="20"/>
+        </w:rPr>
+        <w:t>May 21, 2026</w:t>
+      </w:r>
+    </w:p>
+    <w:p>
+      <w:pPr>
+        <w:pBdr>
+          <w:top w:val="single" w:sz="6" w:space="1" w:color="auto"/>
+          <w:bottom w:val="single" w:sz="6" w:space="1" w:color="auto"/>
+        </w:pBdr>
+        <w:rPr>
+          <w:rFonts w:ascii="Arial" w:hAnsi="Arial" w:cs="Arial"/>
+          <w:sz w:val="20"/>
+        </w:rPr>
+      </w:pPr>
+    </w:p>
+    <w:p>
+      <w:pPr>
+        <w:pBdr>
+          <w:top w:val="single" w:sz="6" w:space="1" w:color="auto"/>
+          <w:bottom w:val="single" w:sz="6" w:space="1" w:color="auto"/>
+        </w:pBdr>
+        <w:rPr>
+          <w:rFonts w:ascii="Arial" w:hAnsi="Arial" w:cs="Arial"/>
+          <w:sz w:val="20"/>
+        </w:rPr>
+      </w:pPr>
+      <w:r>
+        <w:rPr>
+          <w:rFonts w:ascii="Arial" w:hAnsi="Arial" w:cs="Arial"/>
+          <w:sz w:val="20"/>
+        </w:rPr>
+        <w:t>Customer:</w:t>
+      </w:r>
+    </w:p>
+    <w:p>
+      <w:pPr>
+        <w:pBdr>
+          <w:top w:val="single" w:sz="6" w:space="1" w:color="auto"/>
+          <w:bottom w:val="single" w:sz="6" w:space="1" w:color="auto"/>
+        </w:pBdr>
+        <w:rPr>
+          <w:rFonts w:ascii="Arial" w:hAnsi="Arial" w:cs="Arial"/>
+          <w:sz w:val="20"/>
+        </w:rPr>
+      </w:pPr>
+      <w:r>
+        <w:rPr>
+          <w:rFonts w:ascii="Arial" w:hAnsi="Arial" w:cs="Arial"/>
+          <w:sz w:val="20"/>
+        </w:rPr>
+        <w:t xml:space="preserve">Add “Info” tab of store in </w:t>
+      </w:r>
+      <w:proofErr w:type="spellStart"/>
+      <w:r>
+        <w:rPr>
+          <w:rFonts w:ascii="Arial" w:hAnsi="Arial" w:cs="Arial"/>
+          <w:sz w:val="20"/>
+        </w:rPr>
+        <w:t>ShopPage</w:t>
+      </w:r>
+      <w:bookmarkStart w:id="0" w:name="_GoBack"/>
+      <w:bookmarkEnd w:id="0"/>
+      <w:proofErr w:type="spellEnd"/>
+    </w:p>
+    <w:p>
+      <w:pPr>
+        <w:pBdr>
+          <w:top w:val="single" w:sz="6" w:space="1" w:color="auto"/>
+          <w:bottom w:val="single" w:sz="6" w:space="1" w:color="auto"/>
+        </w:pBdr>
+        <w:rPr>
+          <w:rFonts w:ascii="Arial" w:hAnsi="Arial" w:cs="Arial"/>
+          <w:sz w:val="20"/>
+        </w:rPr>
+      </w:pPr>
+    </w:p>
+    <w:p>
+      <w:pPr>
+        <w:pBdr>
+          <w:top w:val="single" w:sz="6" w:space="1" w:color="auto"/>
+          <w:bottom w:val="single" w:sz="6" w:space="1" w:color="auto"/>
+        </w:pBdr>
+        <w:rPr>
+          <w:rFonts w:ascii="Arial" w:hAnsi="Arial" w:cs="Arial"/>
+          <w:sz w:val="20"/>
+        </w:rPr>
+      </w:pPr>
+    </w:p>
+    <w:p>
+      <w:pPr>
+        <w:rPr>
+          <w:rFonts w:ascii="Arial" w:hAnsi="Arial" w:cs="Arial"/>
+          <w:sz w:val="20"/>
+        </w:rPr>
+      </w:pPr>
+      <w:r>
+        <w:rPr>
+          <w:rFonts w:ascii="Arial" w:hAnsi="Arial" w:cs="Arial"/>
+          <w:sz w:val="20"/>
+        </w:rPr>
+        <w:t>May 13</w:t>
+      </w:r>
+      <w:r>
+        <w:rPr>
+          <w:rFonts w:ascii="Arial" w:hAnsi="Arial" w:cs="Arial"/>
+          <w:sz w:val="20"/>
+        </w:rPr>
+        <w:t>, 2026</w:t>
+      </w:r>
+    </w:p>
+    <w:p>
+      <w:pPr>
         <w:pBdr>
           <w:bottom w:val="single" w:sz="6" w:space="1" w:color="auto"/>
         </w:pBdr>
@@ -216,35 +357,6 @@
           <w:sz w:val="20"/>
         </w:rPr>
       </w:pPr>
-      <w:r>
-        <w:rPr>
-          <w:rFonts w:ascii="Arial" w:hAnsi="Arial" w:cs="Arial"/>
-          <w:sz w:val="20"/>
-        </w:rPr>
-        <w:t>- Update the route ability guards for cashier = DONE, barista, kitchen, and dev scopes.</w:t>
-      </w:r>
-    </w:p>
-    <w:p>
-      <w:pPr>
-        <w:rPr>
-          <w:rFonts w:ascii="Arial" w:hAnsi="Arial" w:cs="Arial"/>
-          <w:sz w:val="20"/>
-        </w:rPr>
-      </w:pPr>
-      <w:r>
-        <w:rPr>
-          <w:rFonts w:ascii="Arial" w:hAnsi="Arial" w:cs="Arial"/>
-          <w:sz w:val="20"/>
-        </w:rPr>
-        <w:t>May 13</w:t>
-      </w:r>
-      <w:r>
-        <w:rPr>
-          <w:rFonts w:ascii="Arial" w:hAnsi="Arial" w:cs="Arial"/>
-          <w:sz w:val="20"/>
-        </w:rPr>
-        <w:t>, 2026</w:t>
-      </w:r>
     </w:p>
     <w:p>
       <w:pPr>
@@ -256,6 +368,13 @@
           <w:sz w:val="20"/>
         </w:rPr>
       </w:pPr>
+      <w:r>
+        <w:rPr>
+          <w:rFonts w:ascii="Arial" w:hAnsi="Arial" w:cs="Arial"/>
+          <w:sz w:val="20"/>
+        </w:rPr>
+        <w:t>Customer:</w:t>
+      </w:r>
     </w:p>
     <w:p>
       <w:pPr>
@@ -272,7 +391,30 @@
           <w:rFonts w:ascii="Arial" w:hAnsi="Arial" w:cs="Arial"/>
           <w:sz w:val="20"/>
         </w:rPr>
-        <w:t>Customer:</w:t>
+        <w:t xml:space="preserve">In </w:t>
+      </w:r>
+      <w:proofErr w:type="spellStart"/>
+      <w:r>
+        <w:rPr>
+          <w:rFonts w:ascii="Arial" w:hAnsi="Arial" w:cs="Arial"/>
+          <w:sz w:val="20"/>
+        </w:rPr>
+        <w:t>HomePage</w:t>
+      </w:r>
+      <w:proofErr w:type="spellEnd"/>
+      <w:r>
+        <w:rPr>
+          <w:rFonts w:ascii="Arial" w:hAnsi="Arial" w:cs="Arial"/>
+          <w:sz w:val="20"/>
+        </w:rPr>
+        <w:t>, put Logo in every store</w:t>
+      </w:r>
+      <w:r>
+        <w:rPr>
+          <w:rFonts w:ascii="Arial" w:hAnsi="Arial" w:cs="Arial"/>
+          <w:sz w:val="20"/>
+        </w:rPr>
+        <w:t xml:space="preserve"> = DONE</w:t>
       </w:r>
     </w:p>
     <w:p>
@@ -290,23 +432,7 @@
           <w:rFonts w:ascii="Arial" w:hAnsi="Arial" w:cs="Arial"/>
           <w:sz w:val="20"/>
         </w:rPr>
-        <w:t xml:space="preserve">In </w:t>
-      </w:r>
-      <w:proofErr w:type="spellStart"/>
-      <w:r>
-        <w:rPr>
-          <w:rFonts w:ascii="Arial" w:hAnsi="Arial" w:cs="Arial"/>
-          <w:sz w:val="20"/>
-        </w:rPr>
-        <w:t>HomePage</w:t>
-      </w:r>
-      <w:proofErr w:type="spellEnd"/>
-      <w:r>
-        <w:rPr>
-          <w:rFonts w:ascii="Arial" w:hAnsi="Arial" w:cs="Arial"/>
-          <w:sz w:val="20"/>
-        </w:rPr>
-        <w:t>, put Logo in every store</w:t>
+        <w:t>Put Home</w:t>
       </w:r>
       <w:r>
         <w:rPr>
@@ -314,6 +440,64 @@
           <w:sz w:val="20"/>
         </w:rPr>
         <w:t xml:space="preserve"> = DONE</w:t>
+      </w:r>
+      <w:r>
+        <w:rPr>
+          <w:rFonts w:ascii="Arial" w:hAnsi="Arial" w:cs="Arial"/>
+          <w:sz w:val="20"/>
+        </w:rPr>
+        <w:t>, Stores</w:t>
+      </w:r>
+      <w:r>
+        <w:rPr>
+          <w:rFonts w:ascii="Arial" w:hAnsi="Arial" w:cs="Arial"/>
+          <w:sz w:val="20"/>
+        </w:rPr>
+        <w:t xml:space="preserve"> = DONE</w:t>
+      </w:r>
+      <w:r>
+        <w:rPr>
+          <w:rFonts w:ascii="Arial" w:hAnsi="Arial" w:cs="Arial"/>
+          <w:sz w:val="20"/>
+        </w:rPr>
+        <w:t xml:space="preserve">, </w:t>
+      </w:r>
+      <w:proofErr w:type="spellStart"/>
+      <w:r>
+        <w:rPr>
+          <w:rFonts w:ascii="Arial" w:hAnsi="Arial" w:cs="Arial"/>
+          <w:sz w:val="20"/>
+        </w:rPr>
+        <w:t>Signout</w:t>
+      </w:r>
+      <w:proofErr w:type="spellEnd"/>
+      <w:r>
+        <w:rPr>
+          <w:rFonts w:ascii="Arial" w:hAnsi="Arial" w:cs="Arial"/>
+          <w:sz w:val="20"/>
+        </w:rPr>
+        <w:t xml:space="preserve"> = DONE</w:t>
+      </w:r>
+      <w:r>
+        <w:rPr>
+          <w:rFonts w:ascii="Arial" w:hAnsi="Arial" w:cs="Arial"/>
+          <w:sz w:val="20"/>
+        </w:rPr>
+        <w:t xml:space="preserve"> in bottom navigation</w:t>
+      </w:r>
+      <w:r>
+        <w:rPr>
+          <w:rFonts w:ascii="Arial" w:hAnsi="Arial" w:cs="Arial"/>
+          <w:sz w:val="20"/>
+        </w:rPr>
+        <w:t xml:space="preserve"> </w:t>
+      </w:r>
+      <w:r>
+        <w:rPr>
+          <w:rFonts w:ascii="Arial" w:hAnsi="Arial" w:cs="Arial"/>
+          <w:sz w:val="20"/>
+        </w:rPr>
+        <w:t>= DONE</w:t>
       </w:r>
     </w:p>
     <w:p>
@@ -326,66 +510,6 @@
           <w:sz w:val="20"/>
         </w:rPr>
       </w:pPr>
-      <w:r>
-        <w:rPr>
-          <w:rFonts w:ascii="Arial" w:hAnsi="Arial" w:cs="Arial"/>
-          <w:sz w:val="20"/>
-        </w:rPr>
-        <w:t>Put Home</w:t>
-      </w:r>
-      <w:r>
-        <w:rPr>
-          <w:rFonts w:ascii="Arial" w:hAnsi="Arial" w:cs="Arial"/>
-          <w:sz w:val="20"/>
-        </w:rPr>
-        <w:t xml:space="preserve"> = DONE</w:t>
-      </w:r>
-      <w:bookmarkStart w:id="0" w:name="_GoBack"/>
-      <w:bookmarkEnd w:id="0"/>
-      <w:r>
-        <w:rPr>
-          <w:rFonts w:ascii="Arial" w:hAnsi="Arial" w:cs="Arial"/>
-          <w:sz w:val="20"/>
-        </w:rPr>
-        <w:t>, Stores</w:t>
-      </w:r>
-      <w:r>
-        <w:rPr>
-          <w:rFonts w:ascii="Arial" w:hAnsi="Arial" w:cs="Arial"/>
-          <w:sz w:val="20"/>
-        </w:rPr>
-        <w:t xml:space="preserve"> = DONE</w:t>
-      </w:r>
-      <w:r>
-        <w:rPr>
-          <w:rFonts w:ascii="Arial" w:hAnsi="Arial" w:cs="Arial"/>
-          <w:sz w:val="20"/>
-        </w:rPr>
-        <w:t xml:space="preserve">, </w:t>
-      </w:r>
-      <w:proofErr w:type="spellStart"/>
-      <w:r>
-        <w:rPr>
-          <w:rFonts w:ascii="Arial" w:hAnsi="Arial" w:cs="Arial"/>
-          <w:sz w:val="20"/>
-        </w:rPr>
-        <w:t>Signout</w:t>
-      </w:r>
-      <w:proofErr w:type="spellEnd"/>
-      <w:r>
-        <w:rPr>
-          <w:rFonts w:ascii="Arial" w:hAnsi="Arial" w:cs="Arial"/>
-          <w:sz w:val="20"/>
-        </w:rPr>
-        <w:t xml:space="preserve"> = DONE</w:t>
-      </w:r>
-      <w:r>
-        <w:rPr>
-          <w:rFonts w:ascii="Arial" w:hAnsi="Arial" w:cs="Arial"/>
-          <w:sz w:val="20"/>
-        </w:rPr>
-        <w:t xml:space="preserve"> in bottom navigation</w:t>
-      </w:r>
     </w:p>
     <w:p>
       <w:pPr>
@@ -400,6 +524,106 @@
     </w:p>
     <w:p>
       <w:pPr>
+        <w:rPr>
+          <w:rFonts w:ascii="Arial" w:hAnsi="Arial" w:cs="Arial"/>
+          <w:sz w:val="20"/>
+        </w:rPr>
+      </w:pPr>
+      <w:r>
+        <w:rPr>
+          <w:rFonts w:ascii="Arial" w:hAnsi="Arial" w:cs="Arial"/>
+          <w:sz w:val="20"/>
+        </w:rPr>
+        <w:t>May 12, 2026</w:t>
+      </w:r>
+    </w:p>
+    <w:p>
+      <w:pPr>
+        <w:rPr>
+          <w:rFonts w:ascii="Arial" w:hAnsi="Arial" w:cs="Arial"/>
+          <w:sz w:val="20"/>
+        </w:rPr>
+      </w:pPr>
+    </w:p>
+    <w:p>
+      <w:pPr>
+        <w:rPr>
+          <w:rFonts w:ascii="Arial" w:hAnsi="Arial" w:cs="Arial"/>
+          <w:sz w:val="20"/>
+        </w:rPr>
+      </w:pPr>
+      <w:r>
+        <w:rPr>
+          <w:rFonts w:ascii="Arial" w:hAnsi="Arial" w:cs="Arial"/>
+          <w:sz w:val="20"/>
+        </w:rPr>
+        <w:t>Admin:</w:t>
+      </w:r>
+    </w:p>
+    <w:p>
+      <w:pPr>
+        <w:rPr>
+          <w:rFonts w:ascii="Arial" w:hAnsi="Arial" w:cs="Arial"/>
+          <w:sz w:val="20"/>
+        </w:rPr>
+      </w:pPr>
+      <w:r>
+        <w:rPr>
+          <w:rFonts w:ascii="Arial" w:hAnsi="Arial" w:cs="Arial"/>
+          <w:sz w:val="20"/>
+        </w:rPr>
+        <w:t xml:space="preserve">- Insert </w:t>
+      </w:r>
+      <w:proofErr w:type="spellStart"/>
+      <w:r>
+        <w:rPr>
+          <w:rFonts w:ascii="Arial" w:hAnsi="Arial" w:cs="Arial"/>
+          <w:sz w:val="20"/>
+        </w:rPr>
+        <w:t>open_at</w:t>
+      </w:r>
+      <w:proofErr w:type="spellEnd"/>
+      <w:r>
+        <w:rPr>
+          <w:rFonts w:ascii="Arial" w:hAnsi="Arial" w:cs="Arial"/>
+          <w:sz w:val="20"/>
+        </w:rPr>
+        <w:t xml:space="preserve"> and </w:t>
+      </w:r>
+      <w:proofErr w:type="spellStart"/>
+      <w:r>
+        <w:rPr>
+          <w:rFonts w:ascii="Arial" w:hAnsi="Arial" w:cs="Arial"/>
+          <w:sz w:val="20"/>
+        </w:rPr>
+        <w:t>close_at</w:t>
+      </w:r>
+      <w:proofErr w:type="spellEnd"/>
+      <w:r>
+        <w:rPr>
+          <w:rFonts w:ascii="Arial" w:hAnsi="Arial" w:cs="Arial"/>
+          <w:sz w:val="20"/>
+        </w:rPr>
+        <w:t xml:space="preserve"> when updating Branch Info = DONE</w:t>
+      </w:r>
+    </w:p>
+    <w:p>
+      <w:pPr>
+        <w:rPr>
+          <w:rFonts w:ascii="Arial" w:hAnsi="Arial" w:cs="Arial"/>
+          <w:sz w:val="20"/>
+        </w:rPr>
+      </w:pPr>
+      <w:r>
+        <w:rPr>
+          <w:rFonts w:ascii="Arial" w:hAnsi="Arial" w:cs="Arial"/>
+          <w:sz w:val="20"/>
+        </w:rPr>
+        <w:t>- When Adding new Stocks or Product Items, after success, the row must be return to 1 only = DONE</w:t>
+      </w:r>
+    </w:p>
+    <w:p>
+      <w:pPr>
         <w:pBdr>
           <w:bottom w:val="single" w:sz="6" w:space="1" w:color="auto"/>
         </w:pBdr>
@@ -408,105 +632,50 @@
           <w:sz w:val="20"/>
         </w:rPr>
       </w:pPr>
-    </w:p>
-    <w:p>
-      <w:pPr>
-        <w:rPr>
-          <w:rFonts w:ascii="Arial" w:hAnsi="Arial" w:cs="Arial"/>
-          <w:sz w:val="20"/>
-        </w:rPr>
-      </w:pPr>
-      <w:r>
-        <w:rPr>
-          <w:rFonts w:ascii="Arial" w:hAnsi="Arial" w:cs="Arial"/>
-          <w:sz w:val="20"/>
-        </w:rPr>
-        <w:t>May 12, 2026</w:t>
-      </w:r>
-    </w:p>
-    <w:p>
-      <w:pPr>
-        <w:rPr>
-          <w:rFonts w:ascii="Arial" w:hAnsi="Arial" w:cs="Arial"/>
-          <w:sz w:val="20"/>
-        </w:rPr>
-      </w:pPr>
-    </w:p>
-    <w:p>
-      <w:pPr>
-        <w:rPr>
-          <w:rFonts w:ascii="Arial" w:hAnsi="Arial" w:cs="Arial"/>
-          <w:sz w:val="20"/>
-        </w:rPr>
-      </w:pPr>
-      <w:r>
-        <w:rPr>
-          <w:rFonts w:ascii="Arial" w:hAnsi="Arial" w:cs="Arial"/>
-          <w:sz w:val="20"/>
-        </w:rPr>
-        <w:t>Admin:</w:t>
-      </w:r>
-    </w:p>
-    <w:p>
-      <w:pPr>
-        <w:rPr>
-          <w:rFonts w:ascii="Arial" w:hAnsi="Arial" w:cs="Arial"/>
-          <w:sz w:val="20"/>
-        </w:rPr>
-      </w:pPr>
-      <w:r>
-        <w:rPr>
-          <w:rFonts w:ascii="Arial" w:hAnsi="Arial" w:cs="Arial"/>
-          <w:sz w:val="20"/>
-        </w:rPr>
-        <w:t xml:space="preserve">- Insert </w:t>
-      </w:r>
-      <w:proofErr w:type="spellStart"/>
-      <w:r>
-        <w:rPr>
-          <w:rFonts w:ascii="Arial" w:hAnsi="Arial" w:cs="Arial"/>
-          <w:sz w:val="20"/>
-        </w:rPr>
-        <w:t>open_at</w:t>
-      </w:r>
-      <w:proofErr w:type="spellEnd"/>
-      <w:r>
-        <w:rPr>
-          <w:rFonts w:ascii="Arial" w:hAnsi="Arial" w:cs="Arial"/>
-          <w:sz w:val="20"/>
-        </w:rPr>
-        <w:t xml:space="preserve"> and </w:t>
-      </w:r>
-      <w:proofErr w:type="spellStart"/>
-      <w:r>
-        <w:rPr>
-          <w:rFonts w:ascii="Arial" w:hAnsi="Arial" w:cs="Arial"/>
-          <w:sz w:val="20"/>
-        </w:rPr>
-        <w:t>close_at</w:t>
-      </w:r>
-      <w:proofErr w:type="spellEnd"/>
-      <w:r>
-        <w:rPr>
-          <w:rFonts w:ascii="Arial" w:hAnsi="Arial" w:cs="Arial"/>
-          <w:sz w:val="20"/>
-        </w:rPr>
-        <w:t xml:space="preserve"> when updating Branch Info = DONE</w:t>
-      </w:r>
-    </w:p>
-    <w:p>
-      <w:pPr>
-        <w:rPr>
-          <w:rFonts w:ascii="Arial" w:hAnsi="Arial" w:cs="Arial"/>
-          <w:sz w:val="20"/>
-        </w:rPr>
-      </w:pPr>
-      <w:r>
-        <w:rPr>
-          <w:rFonts w:ascii="Arial" w:hAnsi="Arial" w:cs="Arial"/>
-          <w:sz w:val="20"/>
-        </w:rPr>
-        <w:t>- When Adding new Stocks or Product Items, after success, the row must be return to 1 only = DONE</w:t>
+      <w:r>
+        <w:rPr>
+          <w:rFonts w:ascii="Arial" w:hAnsi="Arial" w:cs="Arial"/>
+          <w:sz w:val="20"/>
+        </w:rPr>
+        <w:t>- Must be able to copy the link of the store branch = DONE</w:t>
+      </w:r>
+    </w:p>
+    <w:p>
+      <w:pPr>
+        <w:rPr>
+          <w:rFonts w:ascii="Arial" w:hAnsi="Arial" w:cs="Arial"/>
+          <w:sz w:val="20"/>
+        </w:rPr>
+      </w:pPr>
+      <w:r>
+        <w:rPr>
+          <w:rFonts w:ascii="Arial" w:hAnsi="Arial" w:cs="Arial"/>
+          <w:sz w:val="20"/>
+        </w:rPr>
+        <w:t>May 10, 2026</w:t>
+      </w:r>
+    </w:p>
+    <w:p>
+      <w:pPr>
+        <w:rPr>
+          <w:rFonts w:ascii="Arial" w:hAnsi="Arial" w:cs="Arial"/>
+          <w:sz w:val="20"/>
+        </w:rPr>
+      </w:pPr>
+    </w:p>
+    <w:p>
+      <w:pPr>
+        <w:rPr>
+          <w:rFonts w:ascii="Arial" w:hAnsi="Arial" w:cs="Arial"/>
+          <w:sz w:val="20"/>
+        </w:rPr>
+      </w:pPr>
+      <w:r>
+        <w:rPr>
+          <w:rFonts w:ascii="Arial" w:hAnsi="Arial" w:cs="Arial"/>
+          <w:sz w:val="20"/>
+        </w:rPr>
+        <w:t>Customer:</w:t>
       </w:r>
     </w:p>
     <w:p>
@@ -524,62 +693,6 @@
           <w:rFonts w:ascii="Arial" w:hAnsi="Arial" w:cs="Arial"/>
           <w:sz w:val="20"/>
         </w:rPr>
-        <w:t>- Must be able to copy the link of the store branch = DONE</w:t>
-      </w:r>
-    </w:p>
-    <w:p>
-      <w:pPr>
-        <w:rPr>
-          <w:rFonts w:ascii="Arial" w:hAnsi="Arial" w:cs="Arial"/>
-          <w:sz w:val="20"/>
-        </w:rPr>
-      </w:pPr>
-      <w:r>
-        <w:rPr>
-          <w:rFonts w:ascii="Arial" w:hAnsi="Arial" w:cs="Arial"/>
-          <w:sz w:val="20"/>
-        </w:rPr>
-        <w:t>May 10, 2026</w:t>
-      </w:r>
-    </w:p>
-    <w:p>
-      <w:pPr>
-        <w:rPr>
-          <w:rFonts w:ascii="Arial" w:hAnsi="Arial" w:cs="Arial"/>
-          <w:sz w:val="20"/>
-        </w:rPr>
-      </w:pPr>
-    </w:p>
-    <w:p>
-      <w:pPr>
-        <w:rPr>
-          <w:rFonts w:ascii="Arial" w:hAnsi="Arial" w:cs="Arial"/>
-          <w:sz w:val="20"/>
-        </w:rPr>
-      </w:pPr>
-      <w:r>
-        <w:rPr>
-          <w:rFonts w:ascii="Arial" w:hAnsi="Arial" w:cs="Arial"/>
-          <w:sz w:val="20"/>
-        </w:rPr>
-        <w:t>Customer:</w:t>
-      </w:r>
-    </w:p>
-    <w:p>
-      <w:pPr>
-        <w:pBdr>
-          <w:bottom w:val="single" w:sz="6" w:space="1" w:color="auto"/>
-        </w:pBdr>
-        <w:rPr>
-          <w:rFonts w:ascii="Arial" w:hAnsi="Arial" w:cs="Arial"/>
-          <w:sz w:val="20"/>
-        </w:rPr>
-      </w:pPr>
-      <w:r>
-        <w:rPr>
-          <w:rFonts w:ascii="Arial" w:hAnsi="Arial" w:cs="Arial"/>
-          <w:sz w:val="20"/>
-        </w:rPr>
         <w:t>- Update the integrated Map into very smooth plugin = DONE</w:t>
       </w:r>
     </w:p>
@@ -633,7 +746,6 @@
           <w:rFonts w:ascii="Arial" w:hAnsi="Arial" w:cs="Arial"/>
           <w:sz w:val="20"/>
         </w:rPr>
-        <w:lastRenderedPageBreak/>
         <w:t xml:space="preserve">- In </w:t>
       </w:r>
       <w:proofErr w:type="spellStart"/>

</xml_diff>

<commit_message>
Shop accent color added
</commit_message>
<xml_diff>
--- a/IMPORTANT DOCS/WORD/Locinder Updates.docx
+++ b/IMPORTANT DOCS/WORD/Locinder Updates.docx
@@ -208,6 +208,9 @@
     </w:p>
     <w:p>
       <w:pPr>
+        <w:pBdr>
+          <w:bottom w:val="single" w:sz="6" w:space="1" w:color="auto"/>
+        </w:pBdr>
         <w:rPr>
           <w:rFonts w:ascii="Arial" w:hAnsi="Arial" w:cs="Arial"/>
           <w:sz w:val="20"/>
@@ -220,6 +223,97 @@
         </w:rPr>
         <w:t>- Update the route ability guards for cashier = DONE, barista, kitchen, and dev scopes.</w:t>
       </w:r>
+    </w:p>
+    <w:p>
+      <w:pPr>
+        <w:rPr>
+          <w:rFonts w:ascii="Arial" w:hAnsi="Arial" w:cs="Arial"/>
+          <w:sz w:val="20"/>
+        </w:rPr>
+      </w:pPr>
+      <w:r>
+        <w:rPr>
+          <w:rFonts w:ascii="Arial" w:hAnsi="Arial" w:cs="Arial"/>
+          <w:sz w:val="20"/>
+        </w:rPr>
+        <w:t>May 23, 2026</w:t>
+      </w:r>
+    </w:p>
+    <w:p>
+      <w:pPr>
+        <w:rPr>
+          <w:rFonts w:ascii="Arial" w:hAnsi="Arial" w:cs="Arial"/>
+          <w:sz w:val="20"/>
+        </w:rPr>
+      </w:pPr>
+    </w:p>
+    <w:p>
+      <w:pPr>
+        <w:rPr>
+          <w:rFonts w:ascii="Arial" w:hAnsi="Arial" w:cs="Arial"/>
+          <w:sz w:val="20"/>
+        </w:rPr>
+      </w:pPr>
+      <w:r>
+        <w:rPr>
+          <w:rFonts w:ascii="Arial" w:hAnsi="Arial" w:cs="Arial"/>
+          <w:sz w:val="20"/>
+        </w:rPr>
+        <w:t>Hosting Database:</w:t>
+      </w:r>
+    </w:p>
+    <w:p>
+      <w:pPr>
+        <w:rPr>
+          <w:rFonts w:ascii="Arial" w:hAnsi="Arial" w:cs="Arial"/>
+          <w:sz w:val="20"/>
+        </w:rPr>
+      </w:pPr>
+      <w:r>
+        <w:rPr>
+          <w:rFonts w:ascii="Arial" w:hAnsi="Arial" w:cs="Arial"/>
+          <w:sz w:val="20"/>
+        </w:rPr>
+        <w:t>Add ‘</w:t>
+      </w:r>
+      <w:r>
+        <w:rPr>
+          <w:rFonts w:ascii="Arial" w:hAnsi="Arial" w:cs="Arial"/>
+          <w:sz w:val="20"/>
+        </w:rPr>
+        <w:t>shop_accent_color</w:t>
+      </w:r>
+      <w:r>
+        <w:rPr>
+          <w:rFonts w:ascii="Arial" w:hAnsi="Arial" w:cs="Arial"/>
+          <w:sz w:val="20"/>
+        </w:rPr>
+        <w:t>’ in tbl_shops</w:t>
+      </w:r>
+      <w:r>
+        <w:rPr>
+          <w:rFonts w:ascii="Arial" w:hAnsi="Arial" w:cs="Arial"/>
+          <w:sz w:val="20"/>
+        </w:rPr>
+        <w:t xml:space="preserve"> = </w:t>
+      </w:r>
+      <w:r>
+        <w:rPr>
+          <w:rFonts w:ascii="Arial" w:hAnsi="Arial" w:cs="Arial"/>
+          <w:sz w:val="20"/>
+        </w:rPr>
+        <w:t>DONE</w:t>
+      </w:r>
+      <w:bookmarkStart w:id="0" w:name="_GoBack"/>
+      <w:bookmarkEnd w:id="0"/>
+    </w:p>
+    <w:p>
+      <w:pPr>
+        <w:rPr>
+          <w:rFonts w:ascii="Arial" w:hAnsi="Arial" w:cs="Arial"/>
+          <w:sz w:val="20"/>
+        </w:rPr>
+      </w:pPr>
     </w:p>
     <w:p>
       <w:pPr>
@@ -287,19 +381,15 @@
           <w:rFonts w:ascii="Arial" w:hAnsi="Arial" w:cs="Arial"/>
           <w:sz w:val="20"/>
         </w:rPr>
-        <w:t xml:space="preserve">Add “Info” tab of store in </w:t>
-      </w:r>
-      <w:proofErr w:type="spellStart"/>
-      <w:r>
-        <w:rPr>
-          <w:rFonts w:ascii="Arial" w:hAnsi="Arial" w:cs="Arial"/>
-          <w:sz w:val="20"/>
-        </w:rPr>
-        <w:t>ShopPage</w:t>
-      </w:r>
-      <w:bookmarkStart w:id="0" w:name="_GoBack"/>
-      <w:bookmarkEnd w:id="0"/>
-      <w:proofErr w:type="spellEnd"/>
+        <w:t>Add “Info” tab of store in ShopPage</w:t>
+      </w:r>
+      <w:r>
+        <w:rPr>
+          <w:rFonts w:ascii="Arial" w:hAnsi="Arial" w:cs="Arial"/>
+          <w:sz w:val="20"/>
+        </w:rPr>
+        <w:t xml:space="preserve"> = DONE</w:t>
+      </w:r>
     </w:p>
     <w:p>
       <w:pPr>
@@ -315,18 +405,6 @@
     </w:p>
     <w:p>
       <w:pPr>
-        <w:pBdr>
-          <w:top w:val="single" w:sz="6" w:space="1" w:color="auto"/>
-          <w:bottom w:val="single" w:sz="6" w:space="1" w:color="auto"/>
-        </w:pBdr>
-        <w:rPr>
-          <w:rFonts w:ascii="Arial" w:hAnsi="Arial" w:cs="Arial"/>
-          <w:sz w:val="20"/>
-        </w:rPr>
-      </w:pPr>
-    </w:p>
-    <w:p>
-      <w:pPr>
         <w:rPr>
           <w:rFonts w:ascii="Arial" w:hAnsi="Arial" w:cs="Arial"/>
           <w:sz w:val="20"/>
@@ -391,23 +469,7 @@
           <w:rFonts w:ascii="Arial" w:hAnsi="Arial" w:cs="Arial"/>
           <w:sz w:val="20"/>
         </w:rPr>
-        <w:t xml:space="preserve">In </w:t>
-      </w:r>
-      <w:proofErr w:type="spellStart"/>
-      <w:r>
-        <w:rPr>
-          <w:rFonts w:ascii="Arial" w:hAnsi="Arial" w:cs="Arial"/>
-          <w:sz w:val="20"/>
-        </w:rPr>
-        <w:t>HomePage</w:t>
-      </w:r>
-      <w:proofErr w:type="spellEnd"/>
-      <w:r>
-        <w:rPr>
-          <w:rFonts w:ascii="Arial" w:hAnsi="Arial" w:cs="Arial"/>
-          <w:sz w:val="20"/>
-        </w:rPr>
-        <w:t>, put Logo in every store</w:t>
+        <w:t>In HomePage, put Logo in every store</w:t>
       </w:r>
       <w:r>
         <w:rPr>
@@ -462,42 +524,26 @@
         </w:rPr>
         <w:t xml:space="preserve">, </w:t>
       </w:r>
-      <w:proofErr w:type="spellStart"/>
-      <w:r>
-        <w:rPr>
-          <w:rFonts w:ascii="Arial" w:hAnsi="Arial" w:cs="Arial"/>
-          <w:sz w:val="20"/>
-        </w:rPr>
-        <w:t>Signout</w:t>
-      </w:r>
-      <w:proofErr w:type="spellEnd"/>
+      <w:r>
+        <w:rPr>
+          <w:rFonts w:ascii="Arial" w:hAnsi="Arial" w:cs="Arial"/>
+          <w:sz w:val="20"/>
+        </w:rPr>
+        <w:t>Signout = DONE</w:t>
+      </w:r>
+      <w:r>
+        <w:rPr>
+          <w:rFonts w:ascii="Arial" w:hAnsi="Arial" w:cs="Arial"/>
+          <w:sz w:val="20"/>
+        </w:rPr>
+        <w:t xml:space="preserve"> in bottom navigation</w:t>
+      </w:r>
       <w:r>
         <w:rPr>
           <w:rFonts w:ascii="Arial" w:hAnsi="Arial" w:cs="Arial"/>
           <w:sz w:val="20"/>
         </w:rPr>
         <w:t xml:space="preserve"> = DONE</w:t>
-      </w:r>
-      <w:r>
-        <w:rPr>
-          <w:rFonts w:ascii="Arial" w:hAnsi="Arial" w:cs="Arial"/>
-          <w:sz w:val="20"/>
-        </w:rPr>
-        <w:t xml:space="preserve"> in bottom navigation</w:t>
-      </w:r>
-      <w:r>
-        <w:rPr>
-          <w:rFonts w:ascii="Arial" w:hAnsi="Arial" w:cs="Arial"/>
-          <w:sz w:val="20"/>
-        </w:rPr>
-        <w:t xml:space="preserve"> </w:t>
-      </w:r>
-      <w:r>
-        <w:rPr>
-          <w:rFonts w:ascii="Arial" w:hAnsi="Arial" w:cs="Arial"/>
-          <w:sz w:val="20"/>
-        </w:rPr>
-        <w:t>= DONE</w:t>
       </w:r>
     </w:p>
     <w:p>
@@ -513,6 +559,107 @@
     </w:p>
     <w:p>
       <w:pPr>
+        <w:rPr>
+          <w:rFonts w:ascii="Arial" w:hAnsi="Arial" w:cs="Arial"/>
+          <w:sz w:val="20"/>
+        </w:rPr>
+      </w:pPr>
+      <w:r>
+        <w:rPr>
+          <w:rFonts w:ascii="Arial" w:hAnsi="Arial" w:cs="Arial"/>
+          <w:sz w:val="20"/>
+        </w:rPr>
+        <w:t>May 12, 2026</w:t>
+      </w:r>
+    </w:p>
+    <w:p>
+      <w:pPr>
+        <w:rPr>
+          <w:rFonts w:ascii="Arial" w:hAnsi="Arial" w:cs="Arial"/>
+          <w:sz w:val="20"/>
+        </w:rPr>
+      </w:pPr>
+    </w:p>
+    <w:p>
+      <w:pPr>
+        <w:rPr>
+          <w:rFonts w:ascii="Arial" w:hAnsi="Arial" w:cs="Arial"/>
+          <w:sz w:val="20"/>
+        </w:rPr>
+      </w:pPr>
+      <w:r>
+        <w:rPr>
+          <w:rFonts w:ascii="Arial" w:hAnsi="Arial" w:cs="Arial"/>
+          <w:sz w:val="20"/>
+        </w:rPr>
+        <w:t>Admin:</w:t>
+      </w:r>
+    </w:p>
+    <w:p>
+      <w:pPr>
+        <w:rPr>
+          <w:rFonts w:ascii="Arial" w:hAnsi="Arial" w:cs="Arial"/>
+          <w:sz w:val="20"/>
+        </w:rPr>
+      </w:pPr>
+      <w:r>
+        <w:rPr>
+          <w:rFonts w:ascii="Arial" w:hAnsi="Arial" w:cs="Arial"/>
+          <w:sz w:val="20"/>
+        </w:rPr>
+        <w:t xml:space="preserve">- Insert </w:t>
+      </w:r>
+      <w:proofErr w:type="spellStart"/>
+      <w:r>
+        <w:rPr>
+          <w:rFonts w:ascii="Arial" w:hAnsi="Arial" w:cs="Arial"/>
+          <w:sz w:val="20"/>
+        </w:rPr>
+        <w:t>open_at</w:t>
+      </w:r>
+      <w:proofErr w:type="spellEnd"/>
+      <w:r>
+        <w:rPr>
+          <w:rFonts w:ascii="Arial" w:hAnsi="Arial" w:cs="Arial"/>
+          <w:sz w:val="20"/>
+        </w:rPr>
+        <w:t xml:space="preserve"> and </w:t>
+      </w:r>
+      <w:proofErr w:type="spellStart"/>
+      <w:r>
+        <w:rPr>
+          <w:rFonts w:ascii="Arial" w:hAnsi="Arial" w:cs="Arial"/>
+          <w:sz w:val="20"/>
+        </w:rPr>
+        <w:t>close_at</w:t>
+      </w:r>
+      <w:proofErr w:type="spellEnd"/>
+      <w:r>
+        <w:rPr>
+          <w:rFonts w:ascii="Arial" w:hAnsi="Arial" w:cs="Arial"/>
+          <w:sz w:val="20"/>
+        </w:rPr>
+        <w:t xml:space="preserve"> when updating Branch Info = DONE</w:t>
+      </w:r>
+    </w:p>
+    <w:p>
+      <w:pPr>
+        <w:rPr>
+          <w:rFonts w:ascii="Arial" w:hAnsi="Arial" w:cs="Arial"/>
+          <w:sz w:val="20"/>
+        </w:rPr>
+      </w:pPr>
+      <w:r>
+        <w:rPr>
+          <w:rFonts w:ascii="Arial" w:hAnsi="Arial" w:cs="Arial"/>
+          <w:sz w:val="20"/>
+        </w:rPr>
+        <w:lastRenderedPageBreak/>
+        <w:t>- When Adding new Stocks or Product Items, after success, the row must be return to 1 only = DONE</w:t>
+      </w:r>
+    </w:p>
+    <w:p>
+      <w:pPr>
         <w:pBdr>
           <w:bottom w:val="single" w:sz="6" w:space="1" w:color="auto"/>
         </w:pBdr>
@@ -521,105 +668,50 @@
           <w:sz w:val="20"/>
         </w:rPr>
       </w:pPr>
-    </w:p>
-    <w:p>
-      <w:pPr>
-        <w:rPr>
-          <w:rFonts w:ascii="Arial" w:hAnsi="Arial" w:cs="Arial"/>
-          <w:sz w:val="20"/>
-        </w:rPr>
-      </w:pPr>
-      <w:r>
-        <w:rPr>
-          <w:rFonts w:ascii="Arial" w:hAnsi="Arial" w:cs="Arial"/>
-          <w:sz w:val="20"/>
-        </w:rPr>
-        <w:t>May 12, 2026</w:t>
-      </w:r>
-    </w:p>
-    <w:p>
-      <w:pPr>
-        <w:rPr>
-          <w:rFonts w:ascii="Arial" w:hAnsi="Arial" w:cs="Arial"/>
-          <w:sz w:val="20"/>
-        </w:rPr>
-      </w:pPr>
-    </w:p>
-    <w:p>
-      <w:pPr>
-        <w:rPr>
-          <w:rFonts w:ascii="Arial" w:hAnsi="Arial" w:cs="Arial"/>
-          <w:sz w:val="20"/>
-        </w:rPr>
-      </w:pPr>
-      <w:r>
-        <w:rPr>
-          <w:rFonts w:ascii="Arial" w:hAnsi="Arial" w:cs="Arial"/>
-          <w:sz w:val="20"/>
-        </w:rPr>
-        <w:t>Admin:</w:t>
-      </w:r>
-    </w:p>
-    <w:p>
-      <w:pPr>
-        <w:rPr>
-          <w:rFonts w:ascii="Arial" w:hAnsi="Arial" w:cs="Arial"/>
-          <w:sz w:val="20"/>
-        </w:rPr>
-      </w:pPr>
-      <w:r>
-        <w:rPr>
-          <w:rFonts w:ascii="Arial" w:hAnsi="Arial" w:cs="Arial"/>
-          <w:sz w:val="20"/>
-        </w:rPr>
-        <w:t xml:space="preserve">- Insert </w:t>
-      </w:r>
-      <w:proofErr w:type="spellStart"/>
-      <w:r>
-        <w:rPr>
-          <w:rFonts w:ascii="Arial" w:hAnsi="Arial" w:cs="Arial"/>
-          <w:sz w:val="20"/>
-        </w:rPr>
-        <w:t>open_at</w:t>
-      </w:r>
-      <w:proofErr w:type="spellEnd"/>
-      <w:r>
-        <w:rPr>
-          <w:rFonts w:ascii="Arial" w:hAnsi="Arial" w:cs="Arial"/>
-          <w:sz w:val="20"/>
-        </w:rPr>
-        <w:t xml:space="preserve"> and </w:t>
-      </w:r>
-      <w:proofErr w:type="spellStart"/>
-      <w:r>
-        <w:rPr>
-          <w:rFonts w:ascii="Arial" w:hAnsi="Arial" w:cs="Arial"/>
-          <w:sz w:val="20"/>
-        </w:rPr>
-        <w:t>close_at</w:t>
-      </w:r>
-      <w:proofErr w:type="spellEnd"/>
-      <w:r>
-        <w:rPr>
-          <w:rFonts w:ascii="Arial" w:hAnsi="Arial" w:cs="Arial"/>
-          <w:sz w:val="20"/>
-        </w:rPr>
-        <w:t xml:space="preserve"> when updating Branch Info = DONE</w:t>
-      </w:r>
-    </w:p>
-    <w:p>
-      <w:pPr>
-        <w:rPr>
-          <w:rFonts w:ascii="Arial" w:hAnsi="Arial" w:cs="Arial"/>
-          <w:sz w:val="20"/>
-        </w:rPr>
-      </w:pPr>
-      <w:r>
-        <w:rPr>
-          <w:rFonts w:ascii="Arial" w:hAnsi="Arial" w:cs="Arial"/>
-          <w:sz w:val="20"/>
-        </w:rPr>
-        <w:t>- When Adding new Stocks or Product Items, after success, the row must be return to 1 only = DONE</w:t>
+      <w:r>
+        <w:rPr>
+          <w:rFonts w:ascii="Arial" w:hAnsi="Arial" w:cs="Arial"/>
+          <w:sz w:val="20"/>
+        </w:rPr>
+        <w:t>- Must be able to copy the link of the store branch = DONE</w:t>
+      </w:r>
+    </w:p>
+    <w:p>
+      <w:pPr>
+        <w:rPr>
+          <w:rFonts w:ascii="Arial" w:hAnsi="Arial" w:cs="Arial"/>
+          <w:sz w:val="20"/>
+        </w:rPr>
+      </w:pPr>
+      <w:r>
+        <w:rPr>
+          <w:rFonts w:ascii="Arial" w:hAnsi="Arial" w:cs="Arial"/>
+          <w:sz w:val="20"/>
+        </w:rPr>
+        <w:t>May 10, 2026</w:t>
+      </w:r>
+    </w:p>
+    <w:p>
+      <w:pPr>
+        <w:rPr>
+          <w:rFonts w:ascii="Arial" w:hAnsi="Arial" w:cs="Arial"/>
+          <w:sz w:val="20"/>
+        </w:rPr>
+      </w:pPr>
+    </w:p>
+    <w:p>
+      <w:pPr>
+        <w:rPr>
+          <w:rFonts w:ascii="Arial" w:hAnsi="Arial" w:cs="Arial"/>
+          <w:sz w:val="20"/>
+        </w:rPr>
+      </w:pPr>
+      <w:r>
+        <w:rPr>
+          <w:rFonts w:ascii="Arial" w:hAnsi="Arial" w:cs="Arial"/>
+          <w:sz w:val="20"/>
+        </w:rPr>
+        <w:t>Customer:</w:t>
       </w:r>
     </w:p>
     <w:p>
@@ -637,45 +729,281 @@
           <w:rFonts w:ascii="Arial" w:hAnsi="Arial" w:cs="Arial"/>
           <w:sz w:val="20"/>
         </w:rPr>
-        <w:t>- Must be able to copy the link of the store branch = DONE</w:t>
-      </w:r>
-    </w:p>
-    <w:p>
-      <w:pPr>
-        <w:rPr>
-          <w:rFonts w:ascii="Arial" w:hAnsi="Arial" w:cs="Arial"/>
-          <w:sz w:val="20"/>
-        </w:rPr>
-      </w:pPr>
-      <w:r>
-        <w:rPr>
-          <w:rFonts w:ascii="Arial" w:hAnsi="Arial" w:cs="Arial"/>
-          <w:sz w:val="20"/>
-        </w:rPr>
-        <w:t>May 10, 2026</w:t>
-      </w:r>
-    </w:p>
-    <w:p>
-      <w:pPr>
-        <w:rPr>
-          <w:rFonts w:ascii="Arial" w:hAnsi="Arial" w:cs="Arial"/>
-          <w:sz w:val="20"/>
-        </w:rPr>
-      </w:pPr>
-    </w:p>
-    <w:p>
-      <w:pPr>
-        <w:rPr>
-          <w:rFonts w:ascii="Arial" w:hAnsi="Arial" w:cs="Arial"/>
-          <w:sz w:val="20"/>
-        </w:rPr>
-      </w:pPr>
-      <w:r>
-        <w:rPr>
-          <w:rFonts w:ascii="Arial" w:hAnsi="Arial" w:cs="Arial"/>
-          <w:sz w:val="20"/>
-        </w:rPr>
-        <w:t>Customer:</w:t>
+        <w:t>- Update the integrated Map into very smooth plugin = DONE</w:t>
+      </w:r>
+    </w:p>
+    <w:p>
+      <w:pPr>
+        <w:rPr>
+          <w:rFonts w:ascii="Arial" w:hAnsi="Arial" w:cs="Arial"/>
+          <w:sz w:val="20"/>
+        </w:rPr>
+      </w:pPr>
+      <w:r>
+        <w:rPr>
+          <w:rFonts w:ascii="Arial" w:hAnsi="Arial" w:cs="Arial"/>
+          <w:sz w:val="20"/>
+        </w:rPr>
+        <w:t>May 06, 2026</w:t>
+      </w:r>
+    </w:p>
+    <w:p>
+      <w:pPr>
+        <w:rPr>
+          <w:rFonts w:ascii="Arial" w:hAnsi="Arial" w:cs="Arial"/>
+          <w:sz w:val="20"/>
+        </w:rPr>
+      </w:pPr>
+    </w:p>
+    <w:p>
+      <w:pPr>
+        <w:rPr>
+          <w:rFonts w:ascii="Arial" w:hAnsi="Arial" w:cs="Arial"/>
+          <w:sz w:val="20"/>
+        </w:rPr>
+      </w:pPr>
+      <w:r>
+        <w:rPr>
+          <w:rFonts w:ascii="Arial" w:hAnsi="Arial" w:cs="Arial"/>
+          <w:sz w:val="20"/>
+        </w:rPr>
+        <w:t>To update the online database</w:t>
+      </w:r>
+    </w:p>
+    <w:p>
+      <w:pPr>
+        <w:rPr>
+          <w:rFonts w:ascii="Arial" w:hAnsi="Arial" w:cs="Arial"/>
+          <w:sz w:val="20"/>
+        </w:rPr>
+      </w:pPr>
+      <w:r>
+        <w:rPr>
+          <w:rFonts w:ascii="Arial" w:hAnsi="Arial" w:cs="Arial"/>
+          <w:sz w:val="20"/>
+        </w:rPr>
+        <w:t xml:space="preserve">- In </w:t>
+      </w:r>
+      <w:proofErr w:type="spellStart"/>
+      <w:r>
+        <w:rPr>
+          <w:rFonts w:ascii="Arial" w:hAnsi="Arial" w:cs="Arial"/>
+          <w:sz w:val="20"/>
+        </w:rPr>
+        <w:t>tbl_shop_branch</w:t>
+      </w:r>
+      <w:proofErr w:type="spellEnd"/>
+      <w:r>
+        <w:rPr>
+          <w:rFonts w:ascii="Arial" w:hAnsi="Arial" w:cs="Arial"/>
+          <w:sz w:val="20"/>
+        </w:rPr>
+        <w:t>, add the following columns;</w:t>
+      </w:r>
+    </w:p>
+    <w:p>
+      <w:pPr>
+        <w:rPr>
+          <w:rFonts w:ascii="Arial" w:hAnsi="Arial" w:cs="Arial"/>
+          <w:sz w:val="20"/>
+        </w:rPr>
+      </w:pPr>
+      <w:r>
+        <w:rPr>
+          <w:rFonts w:ascii="Arial" w:hAnsi="Arial" w:cs="Arial"/>
+          <w:sz w:val="20"/>
+        </w:rPr>
+        <w:tab/>
+        <w:t xml:space="preserve">1. </w:t>
+      </w:r>
+      <w:proofErr w:type="spellStart"/>
+      <w:r>
+        <w:rPr>
+          <w:rFonts w:ascii="Arial" w:hAnsi="Arial" w:cs="Arial"/>
+          <w:sz w:val="20"/>
+        </w:rPr>
+        <w:t>open_</w:t>
+      </w:r>
+      <w:proofErr w:type="gramStart"/>
+      <w:r>
+        <w:rPr>
+          <w:rFonts w:ascii="Arial" w:hAnsi="Arial" w:cs="Arial"/>
+          <w:sz w:val="20"/>
+        </w:rPr>
+        <w:t>at</w:t>
+      </w:r>
+      <w:proofErr w:type="spellEnd"/>
+      <w:r>
+        <w:rPr>
+          <w:rFonts w:ascii="Arial" w:hAnsi="Arial" w:cs="Arial"/>
+          <w:sz w:val="20"/>
+        </w:rPr>
+        <w:t xml:space="preserve">  =</w:t>
+      </w:r>
+      <w:proofErr w:type="gramEnd"/>
+      <w:r>
+        <w:rPr>
+          <w:rFonts w:ascii="Arial" w:hAnsi="Arial" w:cs="Arial"/>
+          <w:sz w:val="20"/>
+        </w:rPr>
+        <w:t xml:space="preserve"> DONE</w:t>
+      </w:r>
+    </w:p>
+    <w:p>
+      <w:pPr>
+        <w:rPr>
+          <w:rFonts w:ascii="Arial" w:hAnsi="Arial" w:cs="Arial"/>
+          <w:sz w:val="20"/>
+        </w:rPr>
+      </w:pPr>
+      <w:r>
+        <w:rPr>
+          <w:rFonts w:ascii="Arial" w:hAnsi="Arial" w:cs="Arial"/>
+          <w:sz w:val="20"/>
+        </w:rPr>
+        <w:tab/>
+        <w:t xml:space="preserve">2. </w:t>
+      </w:r>
+      <w:proofErr w:type="spellStart"/>
+      <w:r>
+        <w:rPr>
+          <w:rFonts w:ascii="Arial" w:hAnsi="Arial" w:cs="Arial"/>
+          <w:sz w:val="20"/>
+        </w:rPr>
+        <w:t>close_</w:t>
+      </w:r>
+      <w:proofErr w:type="gramStart"/>
+      <w:r>
+        <w:rPr>
+          <w:rFonts w:ascii="Arial" w:hAnsi="Arial" w:cs="Arial"/>
+          <w:sz w:val="20"/>
+        </w:rPr>
+        <w:t>at</w:t>
+      </w:r>
+      <w:proofErr w:type="spellEnd"/>
+      <w:r>
+        <w:rPr>
+          <w:rFonts w:ascii="Arial" w:hAnsi="Arial" w:cs="Arial"/>
+          <w:sz w:val="20"/>
+        </w:rPr>
+        <w:t xml:space="preserve">  =</w:t>
+      </w:r>
+      <w:proofErr w:type="gramEnd"/>
+      <w:r>
+        <w:rPr>
+          <w:rFonts w:ascii="Arial" w:hAnsi="Arial" w:cs="Arial"/>
+          <w:sz w:val="20"/>
+        </w:rPr>
+        <w:t xml:space="preserve"> DONE</w:t>
+      </w:r>
+    </w:p>
+    <w:p>
+      <w:pPr>
+        <w:rPr>
+          <w:rFonts w:ascii="Arial" w:hAnsi="Arial" w:cs="Arial"/>
+          <w:sz w:val="20"/>
+        </w:rPr>
+      </w:pPr>
+      <w:r>
+        <w:rPr>
+          <w:rFonts w:ascii="Arial" w:hAnsi="Arial" w:cs="Arial"/>
+          <w:sz w:val="20"/>
+        </w:rPr>
+        <w:tab/>
+      </w:r>
+      <w:proofErr w:type="gramStart"/>
+      <w:r>
+        <w:rPr>
+          <w:rFonts w:ascii="Arial" w:hAnsi="Arial" w:cs="Arial"/>
+          <w:sz w:val="20"/>
+        </w:rPr>
+        <w:t>3.is</w:t>
+      </w:r>
+      <w:proofErr w:type="gramEnd"/>
+      <w:r>
+        <w:rPr>
+          <w:rFonts w:ascii="Arial" w:hAnsi="Arial" w:cs="Arial"/>
+          <w:sz w:val="20"/>
+        </w:rPr>
+        <w:t>_overnight  = DONE</w:t>
+      </w:r>
+    </w:p>
+    <w:p>
+      <w:pPr>
+        <w:rPr>
+          <w:rFonts w:ascii="Arial" w:hAnsi="Arial" w:cs="Arial"/>
+          <w:sz w:val="20"/>
+        </w:rPr>
+      </w:pPr>
+      <w:r>
+        <w:rPr>
+          <w:rFonts w:ascii="Arial" w:hAnsi="Arial" w:cs="Arial"/>
+          <w:sz w:val="20"/>
+        </w:rPr>
+        <w:t xml:space="preserve">- Copy the </w:t>
+      </w:r>
+      <w:proofErr w:type="spellStart"/>
+      <w:r>
+        <w:rPr>
+          <w:rFonts w:ascii="Arial" w:hAnsi="Arial" w:cs="Arial"/>
+          <w:sz w:val="20"/>
+        </w:rPr>
+        <w:t>open_at</w:t>
+      </w:r>
+      <w:proofErr w:type="spellEnd"/>
+      <w:r>
+        <w:rPr>
+          <w:rFonts w:ascii="Arial" w:hAnsi="Arial" w:cs="Arial"/>
+          <w:sz w:val="20"/>
+        </w:rPr>
+        <w:t xml:space="preserve"> and close at of tbl_shops to </w:t>
+      </w:r>
+      <w:proofErr w:type="spellStart"/>
+      <w:r>
+        <w:rPr>
+          <w:rFonts w:ascii="Arial" w:hAnsi="Arial" w:cs="Arial"/>
+          <w:sz w:val="20"/>
+        </w:rPr>
+        <w:t>tbl_shop_branch</w:t>
+      </w:r>
+      <w:proofErr w:type="spellEnd"/>
+      <w:r>
+        <w:rPr>
+          <w:rFonts w:ascii="Arial" w:hAnsi="Arial" w:cs="Arial"/>
+          <w:sz w:val="20"/>
+        </w:rPr>
+        <w:t xml:space="preserve"> = DONE</w:t>
+      </w:r>
+    </w:p>
+    <w:p>
+      <w:pPr>
+        <w:rPr>
+          <w:rFonts w:ascii="Arial" w:hAnsi="Arial" w:cs="Arial"/>
+          <w:sz w:val="20"/>
+        </w:rPr>
+      </w:pPr>
+      <w:r>
+        <w:rPr>
+          <w:rFonts w:ascii="Arial" w:hAnsi="Arial" w:cs="Arial"/>
+          <w:sz w:val="20"/>
+        </w:rPr>
+        <w:t xml:space="preserve">- In Admin registration, add current location to fill the </w:t>
+      </w:r>
+      <w:proofErr w:type="spellStart"/>
+      <w:r>
+        <w:rPr>
+          <w:rFonts w:ascii="Arial" w:hAnsi="Arial" w:cs="Arial"/>
+          <w:sz w:val="20"/>
+        </w:rPr>
+        <w:t>latitue</w:t>
+      </w:r>
+      <w:proofErr w:type="spellEnd"/>
+      <w:r>
+        <w:rPr>
+          <w:rFonts w:ascii="Arial" w:hAnsi="Arial" w:cs="Arial"/>
+          <w:sz w:val="20"/>
+        </w:rPr>
+        <w:t xml:space="preserve"> and longitude = DONE</w:t>
       </w:r>
     </w:p>
     <w:p>
@@ -693,31 +1021,99 @@
           <w:rFonts w:ascii="Arial" w:hAnsi="Arial" w:cs="Arial"/>
           <w:sz w:val="20"/>
         </w:rPr>
-        <w:t>- Update the integrated Map into very smooth plugin = DONE</w:t>
-      </w:r>
-    </w:p>
-    <w:p>
-      <w:pPr>
-        <w:rPr>
-          <w:rFonts w:ascii="Arial" w:hAnsi="Arial" w:cs="Arial"/>
-          <w:sz w:val="20"/>
-        </w:rPr>
-      </w:pPr>
-      <w:r>
-        <w:rPr>
-          <w:rFonts w:ascii="Arial" w:hAnsi="Arial" w:cs="Arial"/>
-          <w:sz w:val="20"/>
-        </w:rPr>
-        <w:t>May 06, 2026</w:t>
-      </w:r>
-    </w:p>
-    <w:p>
-      <w:pPr>
-        <w:rPr>
-          <w:rFonts w:ascii="Arial" w:hAnsi="Arial" w:cs="Arial"/>
-          <w:sz w:val="20"/>
-        </w:rPr>
-      </w:pPr>
+        <w:t xml:space="preserve">- Put </w:t>
+      </w:r>
+      <w:proofErr w:type="spellStart"/>
+      <w:r>
+        <w:rPr>
+          <w:rFonts w:ascii="Arial" w:hAnsi="Arial" w:cs="Arial"/>
+          <w:sz w:val="20"/>
+        </w:rPr>
+        <w:t>Gelolocation</w:t>
+      </w:r>
+      <w:proofErr w:type="spellEnd"/>
+      <w:r>
+        <w:rPr>
+          <w:rFonts w:ascii="Arial" w:hAnsi="Arial" w:cs="Arial"/>
+          <w:sz w:val="20"/>
+        </w:rPr>
+        <w:t xml:space="preserve"> when updating the location add</w:t>
+      </w:r>
+      <w:r>
+        <w:rPr>
+          <w:rFonts w:ascii="Arial" w:hAnsi="Arial" w:cs="Arial"/>
+          <w:sz w:val="20"/>
+        </w:rPr>
+        <w:t>ress of Shop branch info = DONE</w:t>
+      </w:r>
+    </w:p>
+    <w:p>
+      <w:pPr>
+        <w:rPr>
+          <w:rFonts w:ascii="Arial" w:hAnsi="Arial" w:cs="Arial"/>
+          <w:sz w:val="20"/>
+        </w:rPr>
+      </w:pPr>
+      <w:r>
+        <w:rPr>
+          <w:rFonts w:ascii="Arial" w:hAnsi="Arial" w:cs="Arial"/>
+          <w:sz w:val="20"/>
+        </w:rPr>
+        <w:t>May 05, 2026</w:t>
+      </w:r>
+    </w:p>
+    <w:p>
+      <w:pPr>
+        <w:rPr>
+          <w:rFonts w:ascii="Arial" w:hAnsi="Arial" w:cs="Arial"/>
+          <w:sz w:val="20"/>
+        </w:rPr>
+      </w:pPr>
+    </w:p>
+    <w:p>
+      <w:pPr>
+        <w:rPr>
+          <w:rFonts w:ascii="Arial" w:hAnsi="Arial" w:cs="Arial"/>
+          <w:sz w:val="20"/>
+        </w:rPr>
+      </w:pPr>
+      <w:r>
+        <w:rPr>
+          <w:rFonts w:ascii="Arial" w:hAnsi="Arial" w:cs="Arial"/>
+          <w:sz w:val="20"/>
+        </w:rPr>
+        <w:t>Admin:</w:t>
+      </w:r>
+    </w:p>
+    <w:p>
+      <w:pPr>
+        <w:rPr>
+          <w:rFonts w:ascii="Arial" w:hAnsi="Arial" w:cs="Arial"/>
+          <w:sz w:val="20"/>
+        </w:rPr>
+      </w:pPr>
+      <w:r>
+        <w:rPr>
+          <w:rFonts w:ascii="Arial" w:hAnsi="Arial" w:cs="Arial"/>
+          <w:sz w:val="20"/>
+        </w:rPr>
+        <w:t>- Branch details must be able to modify = DONE</w:t>
+      </w:r>
+    </w:p>
+    <w:p>
+      <w:pPr>
+        <w:rPr>
+          <w:rFonts w:ascii="Arial" w:hAnsi="Arial" w:cs="Arial"/>
+          <w:sz w:val="20"/>
+        </w:rPr>
+      </w:pPr>
+      <w:r>
+        <w:rPr>
+          <w:rFonts w:ascii="Arial" w:hAnsi="Arial" w:cs="Arial"/>
+          <w:sz w:val="20"/>
+        </w:rPr>
+        <w:t>- Put Image field for logo of Shop = DONE</w:t>
+      </w:r>
     </w:p>
     <w:p>
       <w:pPr>
@@ -746,399 +1142,7 @@
           <w:rFonts w:ascii="Arial" w:hAnsi="Arial" w:cs="Arial"/>
           <w:sz w:val="20"/>
         </w:rPr>
-        <w:t xml:space="preserve">- In </w:t>
-      </w:r>
-      <w:proofErr w:type="spellStart"/>
-      <w:r>
-        <w:rPr>
-          <w:rFonts w:ascii="Arial" w:hAnsi="Arial" w:cs="Arial"/>
-          <w:sz w:val="20"/>
-        </w:rPr>
-        <w:t>tbl_shop_branch</w:t>
-      </w:r>
-      <w:proofErr w:type="spellEnd"/>
-      <w:r>
-        <w:rPr>
-          <w:rFonts w:ascii="Arial" w:hAnsi="Arial" w:cs="Arial"/>
-          <w:sz w:val="20"/>
-        </w:rPr>
-        <w:t>, add the following columns;</w:t>
-      </w:r>
-    </w:p>
-    <w:p>
-      <w:pPr>
-        <w:rPr>
-          <w:rFonts w:ascii="Arial" w:hAnsi="Arial" w:cs="Arial"/>
-          <w:sz w:val="20"/>
-        </w:rPr>
-      </w:pPr>
-      <w:r>
-        <w:rPr>
-          <w:rFonts w:ascii="Arial" w:hAnsi="Arial" w:cs="Arial"/>
-          <w:sz w:val="20"/>
-        </w:rPr>
-        <w:tab/>
-        <w:t xml:space="preserve">1. </w:t>
-      </w:r>
-      <w:proofErr w:type="spellStart"/>
-      <w:r>
-        <w:rPr>
-          <w:rFonts w:ascii="Arial" w:hAnsi="Arial" w:cs="Arial"/>
-          <w:sz w:val="20"/>
-        </w:rPr>
-        <w:t>open_</w:t>
-      </w:r>
-      <w:proofErr w:type="gramStart"/>
-      <w:r>
-        <w:rPr>
-          <w:rFonts w:ascii="Arial" w:hAnsi="Arial" w:cs="Arial"/>
-          <w:sz w:val="20"/>
-        </w:rPr>
-        <w:t>at</w:t>
-      </w:r>
-      <w:proofErr w:type="spellEnd"/>
-      <w:r>
-        <w:rPr>
-          <w:rFonts w:ascii="Arial" w:hAnsi="Arial" w:cs="Arial"/>
-          <w:sz w:val="20"/>
-        </w:rPr>
-        <w:t xml:space="preserve">  =</w:t>
-      </w:r>
-      <w:proofErr w:type="gramEnd"/>
-      <w:r>
-        <w:rPr>
-          <w:rFonts w:ascii="Arial" w:hAnsi="Arial" w:cs="Arial"/>
-          <w:sz w:val="20"/>
-        </w:rPr>
-        <w:t xml:space="preserve"> DONE</w:t>
-      </w:r>
-    </w:p>
-    <w:p>
-      <w:pPr>
-        <w:rPr>
-          <w:rFonts w:ascii="Arial" w:hAnsi="Arial" w:cs="Arial"/>
-          <w:sz w:val="20"/>
-        </w:rPr>
-      </w:pPr>
-      <w:r>
-        <w:rPr>
-          <w:rFonts w:ascii="Arial" w:hAnsi="Arial" w:cs="Arial"/>
-          <w:sz w:val="20"/>
-        </w:rPr>
-        <w:tab/>
-        <w:t xml:space="preserve">2. </w:t>
-      </w:r>
-      <w:proofErr w:type="spellStart"/>
-      <w:r>
-        <w:rPr>
-          <w:rFonts w:ascii="Arial" w:hAnsi="Arial" w:cs="Arial"/>
-          <w:sz w:val="20"/>
-        </w:rPr>
-        <w:t>close_</w:t>
-      </w:r>
-      <w:proofErr w:type="gramStart"/>
-      <w:r>
-        <w:rPr>
-          <w:rFonts w:ascii="Arial" w:hAnsi="Arial" w:cs="Arial"/>
-          <w:sz w:val="20"/>
-        </w:rPr>
-        <w:t>at</w:t>
-      </w:r>
-      <w:proofErr w:type="spellEnd"/>
-      <w:r>
-        <w:rPr>
-          <w:rFonts w:ascii="Arial" w:hAnsi="Arial" w:cs="Arial"/>
-          <w:sz w:val="20"/>
-        </w:rPr>
-        <w:t xml:space="preserve">  =</w:t>
-      </w:r>
-      <w:proofErr w:type="gramEnd"/>
-      <w:r>
-        <w:rPr>
-          <w:rFonts w:ascii="Arial" w:hAnsi="Arial" w:cs="Arial"/>
-          <w:sz w:val="20"/>
-        </w:rPr>
-        <w:t xml:space="preserve"> DONE</w:t>
-      </w:r>
-    </w:p>
-    <w:p>
-      <w:pPr>
-        <w:rPr>
-          <w:rFonts w:ascii="Arial" w:hAnsi="Arial" w:cs="Arial"/>
-          <w:sz w:val="20"/>
-        </w:rPr>
-      </w:pPr>
-      <w:r>
-        <w:rPr>
-          <w:rFonts w:ascii="Arial" w:hAnsi="Arial" w:cs="Arial"/>
-          <w:sz w:val="20"/>
-        </w:rPr>
-        <w:tab/>
-      </w:r>
-      <w:proofErr w:type="gramStart"/>
-      <w:r>
-        <w:rPr>
-          <w:rFonts w:ascii="Arial" w:hAnsi="Arial" w:cs="Arial"/>
-          <w:sz w:val="20"/>
-        </w:rPr>
-        <w:t>3.is</w:t>
-      </w:r>
-      <w:proofErr w:type="gramEnd"/>
-      <w:r>
-        <w:rPr>
-          <w:rFonts w:ascii="Arial" w:hAnsi="Arial" w:cs="Arial"/>
-          <w:sz w:val="20"/>
-        </w:rPr>
-        <w:t>_overnight  = DONE</w:t>
-      </w:r>
-    </w:p>
-    <w:p>
-      <w:pPr>
-        <w:rPr>
-          <w:rFonts w:ascii="Arial" w:hAnsi="Arial" w:cs="Arial"/>
-          <w:sz w:val="20"/>
-        </w:rPr>
-      </w:pPr>
-      <w:r>
-        <w:rPr>
-          <w:rFonts w:ascii="Arial" w:hAnsi="Arial" w:cs="Arial"/>
-          <w:sz w:val="20"/>
-        </w:rPr>
-        <w:t xml:space="preserve">- Copy the </w:t>
-      </w:r>
-      <w:proofErr w:type="spellStart"/>
-      <w:r>
-        <w:rPr>
-          <w:rFonts w:ascii="Arial" w:hAnsi="Arial" w:cs="Arial"/>
-          <w:sz w:val="20"/>
-        </w:rPr>
-        <w:t>open_at</w:t>
-      </w:r>
-      <w:proofErr w:type="spellEnd"/>
-      <w:r>
-        <w:rPr>
-          <w:rFonts w:ascii="Arial" w:hAnsi="Arial" w:cs="Arial"/>
-          <w:sz w:val="20"/>
-        </w:rPr>
-        <w:t xml:space="preserve"> and close at of </w:t>
-      </w:r>
-      <w:proofErr w:type="spellStart"/>
-      <w:r>
-        <w:rPr>
-          <w:rFonts w:ascii="Arial" w:hAnsi="Arial" w:cs="Arial"/>
-          <w:sz w:val="20"/>
-        </w:rPr>
-        <w:t>tbl_shops</w:t>
-      </w:r>
-      <w:proofErr w:type="spellEnd"/>
-      <w:r>
-        <w:rPr>
-          <w:rFonts w:ascii="Arial" w:hAnsi="Arial" w:cs="Arial"/>
-          <w:sz w:val="20"/>
-        </w:rPr>
-        <w:t xml:space="preserve"> to </w:t>
-      </w:r>
-      <w:proofErr w:type="spellStart"/>
-      <w:r>
-        <w:rPr>
-          <w:rFonts w:ascii="Arial" w:hAnsi="Arial" w:cs="Arial"/>
-          <w:sz w:val="20"/>
-        </w:rPr>
-        <w:t>tbl_shop_branch</w:t>
-      </w:r>
-      <w:proofErr w:type="spellEnd"/>
-      <w:r>
-        <w:rPr>
-          <w:rFonts w:ascii="Arial" w:hAnsi="Arial" w:cs="Arial"/>
-          <w:sz w:val="20"/>
-        </w:rPr>
-        <w:t xml:space="preserve"> = DONE</w:t>
-      </w:r>
-    </w:p>
-    <w:p>
-      <w:pPr>
-        <w:rPr>
-          <w:rFonts w:ascii="Arial" w:hAnsi="Arial" w:cs="Arial"/>
-          <w:sz w:val="20"/>
-        </w:rPr>
-      </w:pPr>
-      <w:r>
-        <w:rPr>
-          <w:rFonts w:ascii="Arial" w:hAnsi="Arial" w:cs="Arial"/>
-          <w:sz w:val="20"/>
-        </w:rPr>
-        <w:t xml:space="preserve">- In Admin registration, add current location to fill the </w:t>
-      </w:r>
-      <w:proofErr w:type="spellStart"/>
-      <w:r>
-        <w:rPr>
-          <w:rFonts w:ascii="Arial" w:hAnsi="Arial" w:cs="Arial"/>
-          <w:sz w:val="20"/>
-        </w:rPr>
-        <w:t>latitue</w:t>
-      </w:r>
-      <w:proofErr w:type="spellEnd"/>
-      <w:r>
-        <w:rPr>
-          <w:rFonts w:ascii="Arial" w:hAnsi="Arial" w:cs="Arial"/>
-          <w:sz w:val="20"/>
-        </w:rPr>
-        <w:t xml:space="preserve"> and longitude = DONE</w:t>
-      </w:r>
-    </w:p>
-    <w:p>
-      <w:pPr>
-        <w:pBdr>
-          <w:bottom w:val="single" w:sz="6" w:space="1" w:color="auto"/>
-        </w:pBdr>
-        <w:rPr>
-          <w:rFonts w:ascii="Arial" w:hAnsi="Arial" w:cs="Arial"/>
-          <w:sz w:val="20"/>
-        </w:rPr>
-      </w:pPr>
-      <w:r>
-        <w:rPr>
-          <w:rFonts w:ascii="Arial" w:hAnsi="Arial" w:cs="Arial"/>
-          <w:sz w:val="20"/>
-        </w:rPr>
-        <w:t xml:space="preserve">- Put </w:t>
-      </w:r>
-      <w:proofErr w:type="spellStart"/>
-      <w:r>
-        <w:rPr>
-          <w:rFonts w:ascii="Arial" w:hAnsi="Arial" w:cs="Arial"/>
-          <w:sz w:val="20"/>
-        </w:rPr>
-        <w:t>Gelolocation</w:t>
-      </w:r>
-      <w:proofErr w:type="spellEnd"/>
-      <w:r>
-        <w:rPr>
-          <w:rFonts w:ascii="Arial" w:hAnsi="Arial" w:cs="Arial"/>
-          <w:sz w:val="20"/>
-        </w:rPr>
-        <w:t xml:space="preserve"> when updating the location add</w:t>
-      </w:r>
-      <w:r>
-        <w:rPr>
-          <w:rFonts w:ascii="Arial" w:hAnsi="Arial" w:cs="Arial"/>
-          <w:sz w:val="20"/>
-        </w:rPr>
-        <w:t>ress of Shop branch info = DONE</w:t>
-      </w:r>
-    </w:p>
-    <w:p>
-      <w:pPr>
-        <w:rPr>
-          <w:rFonts w:ascii="Arial" w:hAnsi="Arial" w:cs="Arial"/>
-          <w:sz w:val="20"/>
-        </w:rPr>
-      </w:pPr>
-      <w:r>
-        <w:rPr>
-          <w:rFonts w:ascii="Arial" w:hAnsi="Arial" w:cs="Arial"/>
-          <w:sz w:val="20"/>
-        </w:rPr>
-        <w:t>May 05, 2026</w:t>
-      </w:r>
-    </w:p>
-    <w:p>
-      <w:pPr>
-        <w:rPr>
-          <w:rFonts w:ascii="Arial" w:hAnsi="Arial" w:cs="Arial"/>
-          <w:sz w:val="20"/>
-        </w:rPr>
-      </w:pPr>
-    </w:p>
-    <w:p>
-      <w:pPr>
-        <w:rPr>
-          <w:rFonts w:ascii="Arial" w:hAnsi="Arial" w:cs="Arial"/>
-          <w:sz w:val="20"/>
-        </w:rPr>
-      </w:pPr>
-      <w:r>
-        <w:rPr>
-          <w:rFonts w:ascii="Arial" w:hAnsi="Arial" w:cs="Arial"/>
-          <w:sz w:val="20"/>
-        </w:rPr>
-        <w:t>Admin:</w:t>
-      </w:r>
-    </w:p>
-    <w:p>
-      <w:pPr>
-        <w:rPr>
-          <w:rFonts w:ascii="Arial" w:hAnsi="Arial" w:cs="Arial"/>
-          <w:sz w:val="20"/>
-        </w:rPr>
-      </w:pPr>
-      <w:r>
-        <w:rPr>
-          <w:rFonts w:ascii="Arial" w:hAnsi="Arial" w:cs="Arial"/>
-          <w:sz w:val="20"/>
-        </w:rPr>
-        <w:t>- Branch details must be able to modify = DONE</w:t>
-      </w:r>
-    </w:p>
-    <w:p>
-      <w:pPr>
-        <w:rPr>
-          <w:rFonts w:ascii="Arial" w:hAnsi="Arial" w:cs="Arial"/>
-          <w:sz w:val="20"/>
-        </w:rPr>
-      </w:pPr>
-      <w:r>
-        <w:rPr>
-          <w:rFonts w:ascii="Arial" w:hAnsi="Arial" w:cs="Arial"/>
-          <w:sz w:val="20"/>
-        </w:rPr>
-        <w:t>- Put Image field for logo of Shop = DONE</w:t>
-      </w:r>
-    </w:p>
-    <w:p>
-      <w:pPr>
-        <w:rPr>
-          <w:rFonts w:ascii="Arial" w:hAnsi="Arial" w:cs="Arial"/>
-          <w:sz w:val="20"/>
-        </w:rPr>
-      </w:pPr>
-      <w:r>
-        <w:rPr>
-          <w:rFonts w:ascii="Arial" w:hAnsi="Arial" w:cs="Arial"/>
-          <w:sz w:val="20"/>
-        </w:rPr>
-        <w:t>To update the online database</w:t>
-      </w:r>
-    </w:p>
-    <w:p>
-      <w:pPr>
-        <w:rPr>
-          <w:rFonts w:ascii="Arial" w:hAnsi="Arial" w:cs="Arial"/>
-          <w:sz w:val="20"/>
-        </w:rPr>
-      </w:pPr>
-      <w:r>
-        <w:rPr>
-          <w:rFonts w:ascii="Arial" w:hAnsi="Arial" w:cs="Arial"/>
-          <w:sz w:val="20"/>
-        </w:rPr>
-        <w:t xml:space="preserve">- In </w:t>
-      </w:r>
-      <w:proofErr w:type="spellStart"/>
-      <w:r>
-        <w:rPr>
-          <w:rFonts w:ascii="Arial" w:hAnsi="Arial" w:cs="Arial"/>
-          <w:sz w:val="20"/>
-        </w:rPr>
-        <w:t>tbl_shops</w:t>
-      </w:r>
-      <w:proofErr w:type="spellEnd"/>
-      <w:r>
-        <w:rPr>
-          <w:rFonts w:ascii="Arial" w:hAnsi="Arial" w:cs="Arial"/>
-          <w:sz w:val="20"/>
-        </w:rPr>
-        <w:t>, add the following columns;</w:t>
+        <w:t>- In tbl_shops, add the following columns;</w:t>
       </w:r>
     </w:p>
     <w:p>

</xml_diff>